<commit_message>
Fix Trapezoidal User Control and INIC
</commit_message>
<xml_diff>
--- a/Artigos/INIC/ArtigoINIC.docx
+++ b/Artigos/INIC/ArtigoINIC.docx
@@ -1,6 +1,6 @@
 
 <file path=word/document.xml><?xml version="1.0" encoding="utf-8"?>
-<w:document xmlns:wpc="http://schemas.microsoft.com/office/word/2010/wordprocessingCanvas" xmlns:cx="http://schemas.microsoft.com/office/drawing/2014/chartex" xmlns:mc="http://schemas.openxmlformats.org/markup-compatibility/2006" xmlns:o="urn:schemas-microsoft-com:office:office" xmlns:r="http://schemas.openxmlformats.org/officeDocument/2006/relationships" xmlns:m="http://schemas.openxmlformats.org/officeDocument/2006/math" xmlns:v="urn:schemas-microsoft-com:vml" xmlns:wp14="http://schemas.microsoft.com/office/word/2010/wordprocessingDrawing" xmlns:wp="http://schemas.openxmlformats.org/drawingml/2006/wordprocessingDrawing" xmlns:w10="urn:schemas-microsoft-com:office:word" xmlns:w="http://schemas.openxmlformats.org/wordprocessingml/2006/main" xmlns:w14="http://schemas.microsoft.com/office/word/2010/wordml" xmlns:w15="http://schemas.microsoft.com/office/word/2012/wordml" xmlns:w16se="http://schemas.microsoft.com/office/word/2015/wordml/symex" xmlns:wpg="http://schemas.microsoft.com/office/word/2010/wordprocessingGroup" xmlns:wpi="http://schemas.microsoft.com/office/word/2010/wordprocessingInk" xmlns:wne="http://schemas.microsoft.com/office/word/2006/wordml" xmlns:wps="http://schemas.microsoft.com/office/word/2010/wordprocessingShape" mc:Ignorable="w14 w15 w16se wp14">
+<w:document xmlns:wpc="http://schemas.microsoft.com/office/word/2010/wordprocessingCanvas" xmlns:cx="http://schemas.microsoft.com/office/drawing/2014/chartex" xmlns:cx1="http://schemas.microsoft.com/office/drawing/2015/9/8/chartex" xmlns:cx2="http://schemas.microsoft.com/office/drawing/2015/10/21/chartex" xmlns:cx3="http://schemas.microsoft.com/office/drawing/2016/5/9/chartex" xmlns:cx4="http://schemas.microsoft.com/office/drawing/2016/5/10/chartex" xmlns:cx5="http://schemas.microsoft.com/office/drawing/2016/5/11/chartex" xmlns:cx6="http://schemas.microsoft.com/office/drawing/2016/5/12/chartex" xmlns:cx7="http://schemas.microsoft.com/office/drawing/2016/5/13/chartex" xmlns:cx8="http://schemas.microsoft.com/office/drawing/2016/5/14/chartex" xmlns:mc="http://schemas.openxmlformats.org/markup-compatibility/2006" xmlns:aink="http://schemas.microsoft.com/office/drawing/2016/ink" xmlns:am3d="http://schemas.microsoft.com/office/drawing/2017/model3d" xmlns:o="urn:schemas-microsoft-com:office:office" xmlns:oel="http://schemas.microsoft.com/office/2019/extlst" xmlns:r="http://schemas.openxmlformats.org/officeDocument/2006/relationships" xmlns:m="http://schemas.openxmlformats.org/officeDocument/2006/math" xmlns:v="urn:schemas-microsoft-com:vml" xmlns:wp14="http://schemas.microsoft.com/office/word/2010/wordprocessingDrawing" xmlns:wp="http://schemas.openxmlformats.org/drawingml/2006/wordprocessingDrawing" xmlns:w10="urn:schemas-microsoft-com:office:word" xmlns:w="http://schemas.openxmlformats.org/wordprocessingml/2006/main" xmlns:w14="http://schemas.microsoft.com/office/word/2010/wordml" xmlns:w15="http://schemas.microsoft.com/office/word/2012/wordml" xmlns:w16cex="http://schemas.microsoft.com/office/word/2018/wordml/cex" xmlns:w16cid="http://schemas.microsoft.com/office/word/2016/wordml/cid" xmlns:w16="http://schemas.microsoft.com/office/word/2018/wordml" xmlns:w16du="http://schemas.microsoft.com/office/word/2023/wordml/word16du" xmlns:w16sdtdh="http://schemas.microsoft.com/office/word/2020/wordml/sdtdatahash" xmlns:w16sdtfl="http://schemas.microsoft.com/office/word/2024/wordml/sdtformatlock" xmlns:w16se="http://schemas.microsoft.com/office/word/2015/wordml/symex" xmlns:wpg="http://schemas.microsoft.com/office/word/2010/wordprocessingGroup" xmlns:wpi="http://schemas.microsoft.com/office/word/2010/wordprocessingInk" xmlns:wne="http://schemas.microsoft.com/office/word/2006/wordml" xmlns:wps="http://schemas.microsoft.com/office/word/2010/wordprocessingShape" mc:Ignorable="w14 w15 w16se w16cid w16 w16cex w16sdtdh w16sdtfl w16du wp14">
   <w:background w:color="FFFFFF"/>
   <w:body>
     <w:p>
@@ -52,7 +52,30 @@
           <w:rFonts w:ascii="Arial" w:hAnsi="Arial"/>
           <w:b/>
         </w:rPr>
-        <w:t>Caio de Lima Antunes, Felipe Vicente Pereira, Gustavo Entony dos Santos Costa</w:t>
+        <w:t xml:space="preserve">Caio de Lima Antunes, Felipe Vicente Pereira, Gustavo </w:t>
+      </w:r>
+      <w:proofErr w:type="spellStart"/>
+      <w:r>
+        <w:rPr>
+          <w:rFonts w:ascii="Arial" w:hAnsi="Arial"/>
+          <w:b/>
+        </w:rPr>
+        <w:t>Entony</w:t>
+      </w:r>
+      <w:proofErr w:type="spellEnd"/>
+      <w:r>
+        <w:rPr>
+          <w:rFonts w:ascii="Arial" w:hAnsi="Arial"/>
+          <w:b/>
+        </w:rPr>
+        <w:t xml:space="preserve"> dos Santos Costa</w:t>
+      </w:r>
+      <w:r>
+        <w:rPr>
+          <w:rFonts w:ascii="Arial" w:hAnsi="Arial"/>
+          <w:b/>
+        </w:rPr>
+        <w:t>, Wagner dos Santos Clementino de Jesus</w:t>
       </w:r>
     </w:p>
     <w:p/>
@@ -61,129 +84,52 @@
         <w:pStyle w:val="Endereos"/>
       </w:pPr>
       <w:r>
-        <w:rPr>
-          <w:vertAlign w:val="superscript"/>
-        </w:rPr>
-        <w:t>1</w:t>
-      </w:r>
-      <w:r>
-        <w:t>Universidade do Vale do Paraíba/Instituto de Pesquisa e Desenvolvimento, Avenida Shishima Hifumi, 2911, Urbanova - 12244-000 - São José dos Campos-SP, Brasil, autor1</w:t>
-      </w:r>
-      <w:r>
-        <w:t>@xxx.exemplo.br</w:t>
-      </w:r>
-      <w:r>
-        <w:t>, autor2</w:t>
-      </w:r>
-      <w:r>
-        <w:t>@xxx.exemplo.br</w:t>
+        <w:t xml:space="preserve">Universidade do Vale do Paraíba/Instituto de Pesquisa e Desenvolvimento, Avenida </w:t>
+      </w:r>
+      <w:proofErr w:type="spellStart"/>
+      <w:r>
+        <w:t>Shishima</w:t>
+      </w:r>
+      <w:proofErr w:type="spellEnd"/>
+      <w:r>
+        <w:t xml:space="preserve"> </w:t>
+      </w:r>
+      <w:proofErr w:type="spellStart"/>
+      <w:r>
+        <w:t>Hifumi</w:t>
+      </w:r>
+      <w:proofErr w:type="spellEnd"/>
+      <w:r>
+        <w:t xml:space="preserve">, 2911, </w:t>
+      </w:r>
+      <w:proofErr w:type="spellStart"/>
+      <w:r>
+        <w:t>Urbanova</w:t>
+      </w:r>
+      <w:proofErr w:type="spellEnd"/>
+      <w:r>
+        <w:t xml:space="preserve"> - 12244-000 - São José dos Campos-SP, Brasil, </w:t>
+      </w:r>
+      <w:r>
+        <w:t>Caioantunesla@gmail.com</w:t>
+      </w:r>
+      <w:r>
+        <w:t xml:space="preserve">, </w:t>
+      </w:r>
+      <w:r>
+        <w:t>felipevp.sjc@gmail.com</w:t>
+      </w:r>
+      <w:r>
+        <w:t xml:space="preserve">, </w:t>
+      </w:r>
+      <w:r>
+        <w:t>gustavoentonysantos18@gmail.com</w:t>
+      </w:r>
+      <w:r>
+        <w:t>, wsantoscj@gmail.com</w:t>
       </w:r>
       <w:r>
         <w:t>.</w:t>
-      </w:r>
-    </w:p>
-    <w:p>
-      <w:pPr>
-        <w:pStyle w:val="Endereos"/>
-        <w:rPr>
-          <w:vertAlign w:val="superscript"/>
-        </w:rPr>
-      </w:pPr>
-    </w:p>
-    <w:p>
-      <w:pPr>
-        <w:pStyle w:val="Endereos"/>
-        <w:jc w:val="both"/>
-        <w:rPr>
-          <w:b/>
-          <w:color w:val="0000FF"/>
-        </w:rPr>
-      </w:pPr>
-      <w:r>
-        <w:rPr>
-          <w:color w:val="0000FF"/>
-        </w:rPr>
-        <w:t>Observações: A numeração das instituições é realizada quando</w:t>
-      </w:r>
-      <w:bookmarkStart w:id="0" w:name="_GoBack"/>
-      <w:bookmarkEnd w:id="0"/>
-      <w:r>
-        <w:rPr>
-          <w:color w:val="0000FF"/>
-        </w:rPr>
-        <w:t xml:space="preserve"> existir mais de uma instituição participante. </w:t>
-      </w:r>
-      <w:r>
-        <w:rPr>
-          <w:b/>
-          <w:color w:val="0000FF"/>
-        </w:rPr>
-        <w:t>Sendo só uma, os autores não serão numerados.</w:t>
-      </w:r>
-    </w:p>
-    <w:p>
-      <w:pPr>
-        <w:pStyle w:val="Endereos"/>
-        <w:jc w:val="both"/>
-        <w:rPr>
-          <w:color w:val="0000FF"/>
-        </w:rPr>
-      </w:pPr>
-      <w:r>
-        <w:rPr>
-          <w:b/>
-          <w:color w:val="FF0000"/>
-        </w:rPr>
-        <w:t>Não ser</w:t>
-      </w:r>
-      <w:r>
-        <w:rPr>
-          <w:b/>
-          <w:color w:val="FF0000"/>
-        </w:rPr>
-        <w:t>ão permitida</w:t>
-      </w:r>
-      <w:r>
-        <w:rPr>
-          <w:b/>
-          <w:color w:val="FF0000"/>
-        </w:rPr>
-        <w:t>s autoria</w:t>
-      </w:r>
-      <w:r>
-        <w:rPr>
-          <w:b/>
-          <w:color w:val="FF0000"/>
-        </w:rPr>
-        <w:t>s</w:t>
-      </w:r>
-      <w:r>
-        <w:rPr>
-          <w:b/>
-          <w:color w:val="FF0000"/>
-        </w:rPr>
-        <w:t xml:space="preserve"> com formato</w:t>
-      </w:r>
-      <w:r>
-        <w:rPr>
-          <w:b/>
-          <w:color w:val="FF0000"/>
-        </w:rPr>
-        <w:t>:</w:t>
-      </w:r>
-      <w:r>
-        <w:rPr>
-          <w:b/>
-          <w:color w:val="FF0000"/>
-        </w:rPr>
-        <w:t xml:space="preserve"> TOLEDO, A.L.</w:t>
-      </w:r>
-      <w:r>
-        <w:rPr>
-          <w:b/>
-          <w:color w:val="FF0000"/>
-        </w:rPr>
-        <w:t>; GOMES, C.</w:t>
       </w:r>
     </w:p>
     <w:p>
@@ -361,7 +307,7 @@
         </w:rPr>
         <w:t xml:space="preserve">é importante que o conteúdo do trabalho redigido esteja em consonância com a natureza do trabalho. </w:t>
       </w:r>
-      <w:bookmarkStart w:id="1" w:name="_Hlk196297407"/>
+      <w:bookmarkStart w:id="0" w:name="_Hlk196297407"/>
       <w:r>
         <w:rPr>
           <w:rFonts w:ascii="Arial" w:hAnsi="Arial"/>
@@ -418,7 +364,7 @@
         </w:rPr>
         <w:t xml:space="preserve"> </w:t>
       </w:r>
-      <w:bookmarkEnd w:id="1"/>
+      <w:bookmarkEnd w:id="0"/>
       <w:r>
         <w:rPr>
           <w:rFonts w:ascii="Arial" w:hAnsi="Arial"/>
@@ -470,7 +416,6 @@
           <w:b/>
           <w:sz w:val="20"/>
         </w:rPr>
-        <w:lastRenderedPageBreak/>
         <w:t>Palavras-chave</w:t>
       </w:r>
       <w:r>
@@ -569,7 +514,6 @@
           <w:sz w:val="24"/>
           <w:lang w:val="pt-BR"/>
         </w:rPr>
-        <w:lastRenderedPageBreak/>
         <w:t>Introdução</w:t>
       </w:r>
     </w:p>
@@ -605,7 +549,25 @@
           <w:sz w:val="20"/>
           <w:szCs w:val="20"/>
         </w:rPr>
-        <w:t>rreira, 2023; Cavanaugh, 2020).</w:t>
+        <w:t xml:space="preserve">rreira, 2023; </w:t>
+      </w:r>
+      <w:proofErr w:type="spellStart"/>
+      <w:r>
+        <w:rPr>
+          <w:rFonts w:ascii="Arial" w:hAnsi="Arial" w:cs="Arial"/>
+          <w:sz w:val="20"/>
+          <w:szCs w:val="20"/>
+        </w:rPr>
+        <w:t>Cavanaugh</w:t>
+      </w:r>
+      <w:proofErr w:type="spellEnd"/>
+      <w:r>
+        <w:rPr>
+          <w:rFonts w:ascii="Arial" w:hAnsi="Arial" w:cs="Arial"/>
+          <w:sz w:val="20"/>
+          <w:szCs w:val="20"/>
+        </w:rPr>
+        <w:t>, 2020).</w:t>
       </w:r>
       <w:r>
         <w:rPr>
@@ -625,6 +587,42 @@
         <w:br/>
         <w:t>O desenvolvimento de um simulador de túnel de vento para aeromodelos visa democratizar o estudo aerodinâmico, oferecendo uma ferramenta de baixo custo, interativa e precisa, capaz de apoiar pesquisas e otimizações em engenharia, potencializando inovações com alcance amplo a partir de intervenções em escala reduzida (Moura et al., 2022; Matos e Botelho, 2007; Barlow, 1999).</w:t>
       </w:r>
+    </w:p>
+    <w:p>
+      <w:pPr>
+        <w:jc w:val="both"/>
+        <w:rPr>
+          <w:rFonts w:ascii="Arial" w:hAnsi="Arial"/>
+          <w:sz w:val="20"/>
+        </w:rPr>
+      </w:pPr>
+    </w:p>
+    <w:p>
+      <w:pPr>
+        <w:jc w:val="both"/>
+        <w:rPr>
+          <w:rFonts w:ascii="Arial" w:hAnsi="Arial"/>
+          <w:sz w:val="20"/>
+        </w:rPr>
+      </w:pPr>
+    </w:p>
+    <w:p>
+      <w:pPr>
+        <w:jc w:val="both"/>
+        <w:rPr>
+          <w:rFonts w:ascii="Arial" w:hAnsi="Arial"/>
+          <w:sz w:val="20"/>
+        </w:rPr>
+      </w:pPr>
+    </w:p>
+    <w:p>
+      <w:pPr>
+        <w:jc w:val="both"/>
+        <w:rPr>
+          <w:rFonts w:ascii="Arial" w:hAnsi="Arial"/>
+          <w:sz w:val="20"/>
+        </w:rPr>
+      </w:pPr>
     </w:p>
     <w:p>
       <w:pPr>
@@ -762,7 +760,44 @@
           <w:sz w:val="20"/>
         </w:rPr>
         <w:br/>
-        <w:t>A modelagem foi realizada no software Blender 3D, ferramenta gratuita e de código aberto voltada à criação de conteúdo tridimensional (BLENDER FOUNDATION, 2018). O programa permitiu a construção e simulação do túnel de vento com base em dimensões reais e princípios físicos simplificados. O levantamento de informações foi realizado por meio de pesquisa bibliográfica e consulta a modelos acadêmicos e industriais já existentes.</w:t>
+        <w:t>A modelagem foi realizada no software Blender 3D, ferramenta gratuita e de código aberto voltada à criação de conteúdo tridimensional (</w:t>
+      </w:r>
+      <w:r>
+        <w:rPr>
+          <w:rFonts w:ascii="Arial" w:hAnsi="Arial" w:cs="Arial"/>
+          <w:sz w:val="20"/>
+        </w:rPr>
+        <w:t>Zh</w:t>
+      </w:r>
+      <w:r>
+        <w:rPr>
+          <w:rFonts w:ascii="Arial" w:hAnsi="Arial" w:cs="Arial"/>
+          <w:sz w:val="20"/>
+        </w:rPr>
+        <w:t>u</w:t>
+      </w:r>
+      <w:r>
+        <w:rPr>
+          <w:rFonts w:ascii="Arial" w:hAnsi="Arial" w:cs="Arial"/>
+          <w:sz w:val="20"/>
+        </w:rPr>
+        <w:t xml:space="preserve">; </w:t>
+      </w:r>
+      <w:proofErr w:type="spellStart"/>
+      <w:r>
+        <w:rPr>
+          <w:rFonts w:ascii="Arial" w:hAnsi="Arial" w:cs="Arial"/>
+          <w:sz w:val="20"/>
+        </w:rPr>
+        <w:t>Whu</w:t>
+      </w:r>
+      <w:proofErr w:type="spellEnd"/>
+      <w:r>
+        <w:rPr>
+          <w:rFonts w:ascii="Arial" w:hAnsi="Arial" w:cs="Arial"/>
+          <w:sz w:val="20"/>
+        </w:rPr>
+        <w:t>, 2018). O programa permitiu a construção e simulação do túnel de vento com base em dimensões reais e princípios físicos simplificados. O levantamento de informações foi realizado por meio de pesquisa bibliográfica e consulta a modelos acadêmicos e industriais já existentes.</w:t>
       </w:r>
       <w:r>
         <w:rPr>
@@ -785,7 +820,37 @@
           <w:sz w:val="20"/>
         </w:rPr>
         <w:br/>
-        <w:t>Segundo a ISO, a computação gráfica é o conjunto de técnicas e ferramentas que convertem dados para ou de um dispositivo gráfico por meio do computador (Azevedo e Conci, 2003). Foram utilizadas primitivas gráficas — elementos básicos que compõem estruturas mais complexas — para modelar e manipular a geometria do túnel e dos aeromodelos (Hetem, 2006).</w:t>
+        <w:t>Segundo a ISO, a computação gráfica é o conjunto de técnicas e ferramentas que convertem dados para ou de um dispositivo gráfico por meio do computador (Azevedo, 20</w:t>
+      </w:r>
+      <w:r>
+        <w:rPr>
+          <w:rFonts w:ascii="Arial" w:hAnsi="Arial" w:cs="Arial"/>
+          <w:sz w:val="20"/>
+        </w:rPr>
+        <w:t>22</w:t>
+      </w:r>
+      <w:r>
+        <w:rPr>
+          <w:rFonts w:ascii="Arial" w:hAnsi="Arial" w:cs="Arial"/>
+          <w:sz w:val="20"/>
+        </w:rPr>
+        <w:t>). Foram utilizadas primitivas gráficas — elementos básicos que compõem estruturas mais complexas — para modelar e manipular a geometria do túnel e dos aeromodelos (</w:t>
+      </w:r>
+      <w:proofErr w:type="spellStart"/>
+      <w:r>
+        <w:rPr>
+          <w:rFonts w:ascii="Arial" w:hAnsi="Arial" w:cs="Arial"/>
+          <w:sz w:val="20"/>
+        </w:rPr>
+        <w:t>Hetem</w:t>
+      </w:r>
+      <w:proofErr w:type="spellEnd"/>
+      <w:r>
+        <w:rPr>
+          <w:rFonts w:ascii="Arial" w:hAnsi="Arial" w:cs="Arial"/>
+          <w:sz w:val="20"/>
+        </w:rPr>
+        <w:t>, 2006).</w:t>
       </w:r>
       <w:r>
         <w:rPr>
@@ -808,7 +873,23 @@
           <w:sz w:val="20"/>
         </w:rPr>
         <w:br/>
-        <w:t>A programação foi utilizada para atribuir funcionalidades ao modelo 3D, permitindo que deixasse de ser apenas uma representação estática e passasse a simular condições dinâmicas, como intensidade, direção e fluxo do vento. Essa integração possibilitou respostas visuais em tempo real, aproximando a simulação das condições reais de funcionamento (Sebesta, 2018).</w:t>
+        <w:t>A programação foi utilizada para atribuir funcionalidades ao modelo 3D, permitindo que deixasse de ser apenas uma representação estática e passasse a simular condições dinâmicas, como intensidade, direção e fluxo do vento. Essa integração possibilitou respostas visuais em tempo real, aproximando a simulação das condições reais de funcionamento (</w:t>
+      </w:r>
+      <w:proofErr w:type="spellStart"/>
+      <w:r>
+        <w:rPr>
+          <w:rFonts w:ascii="Arial" w:hAnsi="Arial" w:cs="Arial"/>
+          <w:sz w:val="20"/>
+        </w:rPr>
+        <w:t>Sebesta</w:t>
+      </w:r>
+      <w:proofErr w:type="spellEnd"/>
+      <w:r>
+        <w:rPr>
+          <w:rFonts w:ascii="Arial" w:hAnsi="Arial" w:cs="Arial"/>
+          <w:sz w:val="20"/>
+        </w:rPr>
+        <w:t>, 2018).</w:t>
       </w:r>
       <w:r>
         <w:rPr>
@@ -831,7 +912,53 @@
           <w:sz w:val="20"/>
         </w:rPr>
         <w:br/>
-        <w:t>A análise aerodinâmica foi baseada no Princípio de Bernoulli, que relaciona a velocidade do fluxo com a pressão, sendo essencial para a compreensão da sustentação gerada pelas asas (Souza e Dourado, 2021). A equação de Bernoulli, expressa como: P + (1/2)ρv² + ρgh = constante, foi aplicada para interpretar os dados obtidos nas simulações, considerando pressão estática, densidade do ar, velocidade e altura de referência (NASA, 2025). A seleção das asas utilizadas nos testes foi baseada em diferentes formatos e áreas, considerando o impacto dessas variáveis no desempenho aerodinâmico (Anderson, 2010).</w:t>
+        <w:t>A análise aerodinâmica foi baseada no Princípio de Bernoulli, que relaciona a velocidade do fluxo com a pressão, sendo essencial para a compreensão da sustentação gerada pelas asas (Souza e Dourado, 2021). A equação de Bernoulli, expressa como: P + (1/</w:t>
+      </w:r>
+      <w:proofErr w:type="gramStart"/>
+      <w:r>
+        <w:rPr>
+          <w:rFonts w:ascii="Arial" w:hAnsi="Arial" w:cs="Arial"/>
+          <w:sz w:val="20"/>
+        </w:rPr>
+        <w:t>2)ρ</w:t>
+      </w:r>
+      <w:proofErr w:type="gramEnd"/>
+      <w:r>
+        <w:rPr>
+          <w:rFonts w:ascii="Arial" w:hAnsi="Arial" w:cs="Arial"/>
+          <w:sz w:val="20"/>
+        </w:rPr>
+        <w:t xml:space="preserve">v² + </w:t>
+      </w:r>
+      <w:proofErr w:type="spellStart"/>
+      <w:r>
+        <w:rPr>
+          <w:rFonts w:ascii="Arial" w:hAnsi="Arial" w:cs="Arial"/>
+          <w:sz w:val="20"/>
+        </w:rPr>
+        <w:t>ρgh</w:t>
+      </w:r>
+      <w:proofErr w:type="spellEnd"/>
+      <w:r>
+        <w:rPr>
+          <w:rFonts w:ascii="Arial" w:hAnsi="Arial" w:cs="Arial"/>
+          <w:sz w:val="20"/>
+        </w:rPr>
+        <w:t xml:space="preserve"> = constante, foi aplicada para interpretar os dados obtidos nas simulações, considerando pressão estática, densidade do ar, velocidade e altura de referência (</w:t>
+      </w:r>
+      <w:r>
+        <w:rPr>
+          <w:rFonts w:ascii="Arial" w:hAnsi="Arial" w:cs="Arial"/>
+          <w:sz w:val="20"/>
+        </w:rPr>
+        <w:t>Hall</w:t>
+      </w:r>
+      <w:r>
+        <w:rPr>
+          <w:rFonts w:ascii="Arial" w:hAnsi="Arial" w:cs="Arial"/>
+          <w:sz w:val="20"/>
+        </w:rPr>
+        <w:t>, 2025). A seleção das asas utilizadas nos testes foi baseada em diferentes formatos e áreas, considerando o impacto dessas variáveis no desempenho aerodinâmico (Anderson, 2010).</w:t>
       </w:r>
     </w:p>
     <w:p>
@@ -904,7 +1031,61 @@
           <w:szCs w:val="20"/>
         </w:rPr>
         <w:br/>
-        <w:t>Com base nos parâmetros definidos, a simulação tridimensional do túnel de vento é processada em segundo plano pelo aplicativo Rapid Author Viewer. Nela, a velocidade do vento é representada pelo ventilador, o escoamento do ar por partículas animadas, e a configuração da asa é visualizada de acordo com o ângulo selecionado.</w:t>
+        <w:t xml:space="preserve">Com base nos parâmetros definidos, a simulação tridimensional do túnel de vento é processada em segundo plano pelo aplicativo </w:t>
+      </w:r>
+      <w:proofErr w:type="spellStart"/>
+      <w:r>
+        <w:rPr>
+          <w:rFonts w:ascii="Arial" w:hAnsi="Arial" w:cs="Arial"/>
+          <w:sz w:val="20"/>
+          <w:szCs w:val="20"/>
+        </w:rPr>
+        <w:t>Rapid</w:t>
+      </w:r>
+      <w:proofErr w:type="spellEnd"/>
+      <w:r>
+        <w:rPr>
+          <w:rFonts w:ascii="Arial" w:hAnsi="Arial" w:cs="Arial"/>
+          <w:sz w:val="20"/>
+          <w:szCs w:val="20"/>
+        </w:rPr>
+        <w:t xml:space="preserve"> </w:t>
+      </w:r>
+      <w:proofErr w:type="spellStart"/>
+      <w:r>
+        <w:rPr>
+          <w:rFonts w:ascii="Arial" w:hAnsi="Arial" w:cs="Arial"/>
+          <w:sz w:val="20"/>
+          <w:szCs w:val="20"/>
+        </w:rPr>
+        <w:t>Author</w:t>
+      </w:r>
+      <w:proofErr w:type="spellEnd"/>
+      <w:r>
+        <w:rPr>
+          <w:rFonts w:ascii="Arial" w:hAnsi="Arial" w:cs="Arial"/>
+          <w:sz w:val="20"/>
+          <w:szCs w:val="20"/>
+        </w:rPr>
+        <w:t xml:space="preserve"> </w:t>
+      </w:r>
+      <w:proofErr w:type="spellStart"/>
+      <w:r>
+        <w:rPr>
+          <w:rFonts w:ascii="Arial" w:hAnsi="Arial" w:cs="Arial"/>
+          <w:sz w:val="20"/>
+          <w:szCs w:val="20"/>
+        </w:rPr>
+        <w:t>Viewer</w:t>
+      </w:r>
+      <w:proofErr w:type="spellEnd"/>
+      <w:r>
+        <w:rPr>
+          <w:rFonts w:ascii="Arial" w:hAnsi="Arial" w:cs="Arial"/>
+          <w:sz w:val="20"/>
+          <w:szCs w:val="20"/>
+        </w:rPr>
+        <w:t>. Nela, a velocidade do vento é representada pelo ventilador, o escoamento do ar por partículas animadas, e a configuração da asa é visualizada de acordo com o ângulo selecionado.</w:t>
       </w:r>
       <w:r>
         <w:rPr>
@@ -964,7 +1145,43 @@
           <w:sz w:val="20"/>
           <w:szCs w:val="20"/>
         </w:rPr>
-        <w:t>Na comparação com soluções já existentes, destaca-se o OpenFOAM, amplamente utilizado para simulações de Dinâmica de Fluidos Computacional (CFD). Apesar de seu alto nível de precisão, trata-se de uma plataforma complexa e abrangente, que exige configurações avançadas e conhecimento técnico especializado. Para usuários cujo foco é a simulação em túneis de vento aplicados a aeromodelos, o uso do OpenFOAM pode se tornar excessivamente oneroso e de difícil implementação.</w:t>
+        <w:t xml:space="preserve">Na comparação com soluções já existentes, destaca-se o </w:t>
+      </w:r>
+      <w:proofErr w:type="spellStart"/>
+      <w:r>
+        <w:rPr>
+          <w:rFonts w:ascii="Arial" w:hAnsi="Arial" w:cs="Arial"/>
+          <w:sz w:val="20"/>
+          <w:szCs w:val="20"/>
+        </w:rPr>
+        <w:t>OpenFOAM</w:t>
+      </w:r>
+      <w:proofErr w:type="spellEnd"/>
+      <w:r>
+        <w:rPr>
+          <w:rFonts w:ascii="Arial" w:hAnsi="Arial" w:cs="Arial"/>
+          <w:sz w:val="20"/>
+          <w:szCs w:val="20"/>
+        </w:rPr>
+        <w:t xml:space="preserve">, amplamente utilizado para simulações de Dinâmica de Fluidos Computacional (CFD). Apesar de seu alto nível de precisão, trata-se de uma plataforma complexa e abrangente, que exige configurações avançadas e conhecimento técnico especializado. Para usuários cujo foco é a simulação em túneis de vento aplicados a aeromodelos, o uso do </w:t>
+      </w:r>
+      <w:proofErr w:type="spellStart"/>
+      <w:r>
+        <w:rPr>
+          <w:rFonts w:ascii="Arial" w:hAnsi="Arial" w:cs="Arial"/>
+          <w:sz w:val="20"/>
+          <w:szCs w:val="20"/>
+        </w:rPr>
+        <w:t>OpenFOAM</w:t>
+      </w:r>
+      <w:proofErr w:type="spellEnd"/>
+      <w:r>
+        <w:rPr>
+          <w:rFonts w:ascii="Arial" w:hAnsi="Arial" w:cs="Arial"/>
+          <w:sz w:val="20"/>
+          <w:szCs w:val="20"/>
+        </w:rPr>
+        <w:t xml:space="preserve"> pode se tornar excessivamente oneroso e de difícil implementação.</w:t>
       </w:r>
       <w:r>
         <w:rPr>
@@ -1226,6 +1443,502 @@
           <w:b/>
         </w:rPr>
       </w:pPr>
+    </w:p>
+    <w:p>
+      <w:pPr>
+        <w:suppressAutoHyphens w:val="0"/>
+        <w:rPr>
+          <w:rFonts w:ascii="Arial" w:hAnsi="Arial" w:cs="Arial"/>
+          <w:b/>
+        </w:rPr>
+      </w:pPr>
+    </w:p>
+    <w:p>
+      <w:pPr>
+        <w:suppressAutoHyphens w:val="0"/>
+        <w:rPr>
+          <w:rFonts w:ascii="Arial" w:hAnsi="Arial" w:cs="Arial"/>
+          <w:b/>
+        </w:rPr>
+      </w:pPr>
+    </w:p>
+    <w:p>
+      <w:pPr>
+        <w:spacing w:line="360" w:lineRule="auto"/>
+        <w:rPr>
+          <w:rFonts w:ascii="Arial" w:hAnsi="Arial" w:cs="Arial"/>
+          <w:b/>
+          <w:bCs/>
+          <w:szCs w:val="20"/>
+          <w:u w:val="single"/>
+        </w:rPr>
+      </w:pPr>
+      <w:r>
+        <w:rPr>
+          <w:rFonts w:ascii="Arial" w:hAnsi="Arial" w:cs="Arial"/>
+          <w:b/>
+          <w:bCs/>
+          <w:szCs w:val="20"/>
+        </w:rPr>
+        <w:lastRenderedPageBreak/>
+        <w:t>R</w:t>
+      </w:r>
+      <w:r>
+        <w:rPr>
+          <w:rFonts w:ascii="Arial" w:hAnsi="Arial" w:cs="Arial"/>
+          <w:b/>
+          <w:bCs/>
+          <w:szCs w:val="20"/>
+        </w:rPr>
+        <w:t>eferências</w:t>
+      </w:r>
+    </w:p>
+    <w:p>
+      <w:pPr>
+        <w:pStyle w:val="NormalWeb"/>
+        <w:jc w:val="both"/>
+        <w:rPr>
+          <w:rFonts w:ascii="Arial" w:hAnsi="Arial" w:cs="Arial"/>
+          <w:sz w:val="20"/>
+          <w:szCs w:val="20"/>
+          <w:lang w:val="en-US"/>
+        </w:rPr>
+      </w:pPr>
+      <w:r>
+        <w:rPr>
+          <w:rFonts w:ascii="Arial" w:hAnsi="Arial" w:cs="Arial"/>
+          <w:sz w:val="20"/>
+          <w:szCs w:val="20"/>
+        </w:rPr>
+        <w:t xml:space="preserve">CONCI, Aura; AZEVEDO, Eduardo; LETA, Fabiana. </w:t>
+      </w:r>
+      <w:r>
+        <w:rPr>
+          <w:rFonts w:ascii="Arial" w:hAnsi="Arial" w:cs="Arial"/>
+          <w:b/>
+          <w:bCs/>
+          <w:sz w:val="20"/>
+          <w:szCs w:val="20"/>
+        </w:rPr>
+        <w:t>Computação gráfica – Volume 2 –</w:t>
+      </w:r>
+      <w:r>
+        <w:rPr>
+          <w:rFonts w:ascii="Arial" w:hAnsi="Arial" w:cs="Arial"/>
+          <w:sz w:val="20"/>
+          <w:szCs w:val="20"/>
+        </w:rPr>
+        <w:t xml:space="preserve"> </w:t>
+      </w:r>
+      <w:r>
+        <w:rPr>
+          <w:rFonts w:ascii="Arial" w:hAnsi="Arial" w:cs="Arial"/>
+          <w:b/>
+          <w:bCs/>
+          <w:sz w:val="20"/>
+          <w:szCs w:val="20"/>
+        </w:rPr>
+        <w:t>Processamento de imagens digitais</w:t>
+      </w:r>
+      <w:r>
+        <w:rPr>
+          <w:rFonts w:ascii="Arial" w:hAnsi="Arial" w:cs="Arial"/>
+          <w:sz w:val="20"/>
+          <w:szCs w:val="20"/>
+        </w:rPr>
+        <w:t xml:space="preserve">. </w:t>
+      </w:r>
+      <w:r>
+        <w:rPr>
+          <w:rFonts w:ascii="Arial" w:hAnsi="Arial" w:cs="Arial"/>
+          <w:sz w:val="20"/>
+          <w:szCs w:val="20"/>
+          <w:lang w:val="en-US"/>
+        </w:rPr>
+        <w:t>Rio de Janeiro: Campus, 2022.</w:t>
+      </w:r>
+    </w:p>
+    <w:p>
+      <w:pPr>
+        <w:pStyle w:val="NormalWeb"/>
+        <w:jc w:val="both"/>
+        <w:rPr>
+          <w:rFonts w:ascii="Arial" w:hAnsi="Arial" w:cs="Arial"/>
+          <w:sz w:val="20"/>
+          <w:szCs w:val="20"/>
+        </w:rPr>
+      </w:pPr>
+      <w:r>
+        <w:rPr>
+          <w:rFonts w:ascii="Arial" w:hAnsi="Arial" w:cs="Arial"/>
+          <w:sz w:val="20"/>
+          <w:szCs w:val="20"/>
+          <w:lang w:val="en-US"/>
+        </w:rPr>
+        <w:t xml:space="preserve">ZHU, </w:t>
+      </w:r>
+      <w:proofErr w:type="spellStart"/>
+      <w:r>
+        <w:rPr>
+          <w:rFonts w:ascii="Arial" w:hAnsi="Arial" w:cs="Arial"/>
+          <w:sz w:val="20"/>
+          <w:szCs w:val="20"/>
+          <w:lang w:val="en-US"/>
+        </w:rPr>
+        <w:t>Zhengwei</w:t>
+      </w:r>
+      <w:proofErr w:type="spellEnd"/>
+      <w:r>
+        <w:rPr>
+          <w:rFonts w:ascii="Arial" w:hAnsi="Arial" w:cs="Arial"/>
+          <w:sz w:val="20"/>
+          <w:szCs w:val="20"/>
+          <w:lang w:val="en-US"/>
+        </w:rPr>
+        <w:t xml:space="preserve">; WU, </w:t>
+      </w:r>
+      <w:proofErr w:type="spellStart"/>
+      <w:r>
+        <w:rPr>
+          <w:rFonts w:ascii="Arial" w:hAnsi="Arial" w:cs="Arial"/>
+          <w:sz w:val="20"/>
+          <w:szCs w:val="20"/>
+          <w:lang w:val="en-US"/>
+        </w:rPr>
+        <w:t>Jingxian</w:t>
+      </w:r>
+      <w:proofErr w:type="spellEnd"/>
+      <w:r>
+        <w:rPr>
+          <w:rFonts w:ascii="Arial" w:hAnsi="Arial" w:cs="Arial"/>
+          <w:sz w:val="20"/>
+          <w:szCs w:val="20"/>
+          <w:lang w:val="en-US"/>
+        </w:rPr>
+        <w:t xml:space="preserve">. </w:t>
+      </w:r>
+      <w:r>
+        <w:rPr>
+          <w:rStyle w:val="Forte"/>
+          <w:rFonts w:ascii="Arial" w:hAnsi="Arial" w:cs="Arial"/>
+          <w:sz w:val="20"/>
+          <w:szCs w:val="20"/>
+          <w:lang w:val="en-US"/>
+        </w:rPr>
+        <w:t>Research on the Application of Blender in 3D Animation Production</w:t>
+      </w:r>
+      <w:r>
+        <w:rPr>
+          <w:rFonts w:ascii="Arial" w:hAnsi="Arial" w:cs="Arial"/>
+          <w:sz w:val="20"/>
+          <w:szCs w:val="20"/>
+          <w:lang w:val="en-US"/>
+        </w:rPr>
+        <w:t>. IOP Conference Series: Materials Science and Engineering, [</w:t>
+      </w:r>
+      <w:proofErr w:type="spellStart"/>
+      <w:r>
+        <w:rPr>
+          <w:rFonts w:ascii="Arial" w:hAnsi="Arial" w:cs="Arial"/>
+          <w:sz w:val="20"/>
+          <w:szCs w:val="20"/>
+          <w:lang w:val="en-US"/>
+        </w:rPr>
+        <w:t>s.l.</w:t>
+      </w:r>
+      <w:proofErr w:type="spellEnd"/>
+      <w:r>
+        <w:rPr>
+          <w:rFonts w:ascii="Arial" w:hAnsi="Arial" w:cs="Arial"/>
+          <w:sz w:val="20"/>
+          <w:szCs w:val="20"/>
+          <w:lang w:val="en-US"/>
+        </w:rPr>
+        <w:t xml:space="preserve">], v. 750, p. 012145, 2024. </w:t>
+      </w:r>
+      <w:r>
+        <w:rPr>
+          <w:rFonts w:ascii="Arial" w:hAnsi="Arial" w:cs="Arial"/>
+          <w:sz w:val="20"/>
+          <w:szCs w:val="20"/>
+        </w:rPr>
+        <w:t>DOI: 10.1088/1757-899X/750/1/012145. Acesso em: 25 jun. 2025.</w:t>
+      </w:r>
+    </w:p>
+    <w:p>
+      <w:pPr>
+        <w:pStyle w:val="NormalWeb"/>
+        <w:jc w:val="both"/>
+        <w:rPr>
+          <w:rFonts w:ascii="Arial" w:hAnsi="Arial" w:cs="Arial"/>
+          <w:sz w:val="20"/>
+          <w:szCs w:val="20"/>
+        </w:rPr>
+      </w:pPr>
+      <w:r>
+        <w:rPr>
+          <w:rFonts w:ascii="Arial" w:hAnsi="Arial" w:cs="Arial"/>
+          <w:sz w:val="20"/>
+          <w:szCs w:val="20"/>
+        </w:rPr>
+        <w:t xml:space="preserve">HETEM JUNIOR, Annibal. </w:t>
+      </w:r>
+      <w:r>
+        <w:rPr>
+          <w:rFonts w:ascii="Arial" w:hAnsi="Arial" w:cs="Arial"/>
+          <w:b/>
+          <w:bCs/>
+          <w:sz w:val="20"/>
+          <w:szCs w:val="20"/>
+        </w:rPr>
+        <w:t>Computação gráfica</w:t>
+      </w:r>
+      <w:r>
+        <w:rPr>
+          <w:rFonts w:ascii="Arial" w:hAnsi="Arial" w:cs="Arial"/>
+          <w:sz w:val="20"/>
+          <w:szCs w:val="20"/>
+        </w:rPr>
+        <w:t>. Rio de Janeiro: LTC, 2006.</w:t>
+      </w:r>
+    </w:p>
+    <w:p>
+      <w:pPr>
+        <w:pStyle w:val="NormalWeb"/>
+        <w:jc w:val="both"/>
+        <w:rPr>
+          <w:rFonts w:ascii="Arial" w:hAnsi="Arial" w:cs="Arial"/>
+          <w:sz w:val="20"/>
+          <w:szCs w:val="20"/>
+        </w:rPr>
+      </w:pPr>
+      <w:r>
+        <w:rPr>
+          <w:rFonts w:ascii="Arial" w:hAnsi="Arial" w:cs="Arial"/>
+          <w:sz w:val="20"/>
+          <w:szCs w:val="20"/>
+        </w:rPr>
+        <w:t xml:space="preserve">SOUZA, Matheus </w:t>
+      </w:r>
+      <w:proofErr w:type="spellStart"/>
+      <w:r>
+        <w:rPr>
+          <w:rFonts w:ascii="Arial" w:hAnsi="Arial" w:cs="Arial"/>
+          <w:sz w:val="20"/>
+          <w:szCs w:val="20"/>
+        </w:rPr>
+        <w:t>Lecchi</w:t>
+      </w:r>
+      <w:proofErr w:type="spellEnd"/>
+      <w:r>
+        <w:rPr>
+          <w:rFonts w:ascii="Arial" w:hAnsi="Arial" w:cs="Arial"/>
+          <w:sz w:val="20"/>
+          <w:szCs w:val="20"/>
+        </w:rPr>
+        <w:t xml:space="preserve">; DOURADO, </w:t>
+      </w:r>
+      <w:proofErr w:type="spellStart"/>
+      <w:r>
+        <w:rPr>
+          <w:rFonts w:ascii="Arial" w:hAnsi="Arial" w:cs="Arial"/>
+          <w:sz w:val="20"/>
+          <w:szCs w:val="20"/>
+        </w:rPr>
+        <w:t>Harerton</w:t>
+      </w:r>
+      <w:proofErr w:type="spellEnd"/>
+      <w:r>
+        <w:rPr>
+          <w:rFonts w:ascii="Arial" w:hAnsi="Arial" w:cs="Arial"/>
+          <w:sz w:val="20"/>
+          <w:szCs w:val="20"/>
+        </w:rPr>
+        <w:t xml:space="preserve"> Oliveira. </w:t>
+      </w:r>
+      <w:r>
+        <w:rPr>
+          <w:rStyle w:val="Forte"/>
+          <w:rFonts w:ascii="Arial" w:hAnsi="Arial" w:cs="Arial"/>
+          <w:sz w:val="20"/>
+          <w:szCs w:val="20"/>
+        </w:rPr>
+        <w:t>Análise Computacional Aerodinâmica de um Perfil NACA 23015</w:t>
+      </w:r>
+      <w:r>
+        <w:rPr>
+          <w:rFonts w:ascii="Arial" w:hAnsi="Arial" w:cs="Arial"/>
+          <w:sz w:val="20"/>
+          <w:szCs w:val="20"/>
+        </w:rPr>
+        <w:t>. In: JORNADA DE INICIAÇÃO CIENTÍFICA DA FAACZ, 2021. Anais [...]. Linhares: Faculdade de Aracruz – FAACZ, 2021. Disponível em: https://www.faacz.com.br/portal/conteudo/iniciacao_cientifica/programa_de_iniciacao_cientifica/2021/anais/analise_computacional_aerodinamica_de_um_perfil_naca_23015.pdf. Acesso em: 15 maio 2025.</w:t>
+      </w:r>
+    </w:p>
+    <w:p>
+      <w:pPr>
+        <w:pStyle w:val="NormalWeb"/>
+        <w:jc w:val="both"/>
+        <w:rPr>
+          <w:rFonts w:ascii="Arial" w:hAnsi="Arial" w:cs="Arial"/>
+          <w:sz w:val="20"/>
+          <w:szCs w:val="20"/>
+        </w:rPr>
+      </w:pPr>
+      <w:r>
+        <w:rPr>
+          <w:rFonts w:ascii="Arial" w:hAnsi="Arial" w:cs="Arial"/>
+          <w:sz w:val="20"/>
+          <w:szCs w:val="20"/>
+        </w:rPr>
+        <w:t xml:space="preserve">HALL, Nancy. </w:t>
+      </w:r>
+      <w:proofErr w:type="spellStart"/>
+      <w:r>
+        <w:rPr>
+          <w:rStyle w:val="Forte"/>
+          <w:rFonts w:ascii="Arial" w:hAnsi="Arial" w:cs="Arial"/>
+          <w:sz w:val="20"/>
+          <w:szCs w:val="20"/>
+        </w:rPr>
+        <w:t>Bernoulli's</w:t>
+      </w:r>
+      <w:proofErr w:type="spellEnd"/>
+      <w:r>
+        <w:rPr>
+          <w:rStyle w:val="Forte"/>
+          <w:rFonts w:ascii="Arial" w:hAnsi="Arial" w:cs="Arial"/>
+          <w:sz w:val="20"/>
+          <w:szCs w:val="20"/>
+        </w:rPr>
+        <w:t xml:space="preserve"> </w:t>
+      </w:r>
+      <w:proofErr w:type="spellStart"/>
+      <w:r>
+        <w:rPr>
+          <w:rStyle w:val="Forte"/>
+          <w:rFonts w:ascii="Arial" w:hAnsi="Arial" w:cs="Arial"/>
+          <w:sz w:val="20"/>
+          <w:szCs w:val="20"/>
+        </w:rPr>
+        <w:t>Principle</w:t>
+      </w:r>
+      <w:proofErr w:type="spellEnd"/>
+      <w:r>
+        <w:rPr>
+          <w:rFonts w:ascii="Arial" w:hAnsi="Arial" w:cs="Arial"/>
+          <w:sz w:val="20"/>
+          <w:szCs w:val="20"/>
+        </w:rPr>
+        <w:t xml:space="preserve">. NASA Glenn </w:t>
+      </w:r>
+      <w:proofErr w:type="spellStart"/>
+      <w:r>
+        <w:rPr>
+          <w:rFonts w:ascii="Arial" w:hAnsi="Arial" w:cs="Arial"/>
+          <w:sz w:val="20"/>
+          <w:szCs w:val="20"/>
+        </w:rPr>
+        <w:t>Research</w:t>
+      </w:r>
+      <w:proofErr w:type="spellEnd"/>
+      <w:r>
+        <w:rPr>
+          <w:rFonts w:ascii="Arial" w:hAnsi="Arial" w:cs="Arial"/>
+          <w:sz w:val="20"/>
+          <w:szCs w:val="20"/>
+        </w:rPr>
+        <w:t xml:space="preserve"> Center, 2021. Disponível em: https://www.grc.nasa.gov/www/k-12/airplane/bern.html. Acesso em: 15 maio 2025.</w:t>
+      </w:r>
+    </w:p>
+    <w:p>
+      <w:pPr>
+        <w:pStyle w:val="NormalWeb"/>
+        <w:jc w:val="both"/>
+        <w:rPr>
+          <w:rFonts w:ascii="Arial" w:hAnsi="Arial" w:cs="Arial"/>
+          <w:sz w:val="20"/>
+          <w:szCs w:val="20"/>
+          <w:lang w:val="en-US"/>
+        </w:rPr>
+      </w:pPr>
+      <w:r>
+        <w:rPr>
+          <w:rFonts w:ascii="Arial" w:hAnsi="Arial" w:cs="Arial"/>
+          <w:sz w:val="20"/>
+          <w:szCs w:val="20"/>
+          <w:lang w:val="en-US"/>
+        </w:rPr>
+        <w:t xml:space="preserve">ANDERSON, John D. </w:t>
+      </w:r>
+      <w:r>
+        <w:rPr>
+          <w:rStyle w:val="Forte"/>
+          <w:rFonts w:ascii="Arial" w:hAnsi="Arial" w:cs="Arial"/>
+          <w:sz w:val="20"/>
+          <w:szCs w:val="20"/>
+          <w:lang w:val="en-US"/>
+        </w:rPr>
+        <w:t>Aircraft: Performance and Design</w:t>
+      </w:r>
+      <w:r>
+        <w:rPr>
+          <w:rFonts w:ascii="Arial" w:hAnsi="Arial" w:cs="Arial"/>
+          <w:sz w:val="20"/>
+          <w:szCs w:val="20"/>
+          <w:lang w:val="en-US"/>
+        </w:rPr>
+        <w:t>. 5. ed. McGraw-Hill, 2010. 580p.</w:t>
+      </w:r>
+    </w:p>
+    <w:p>
+      <w:pPr>
+        <w:jc w:val="both"/>
+        <w:rPr>
+          <w:rFonts w:ascii="Arial" w:hAnsi="Arial" w:cs="Arial"/>
+          <w:color w:val="000000" w:themeColor="text1"/>
+          <w:sz w:val="20"/>
+          <w:szCs w:val="20"/>
+        </w:rPr>
+      </w:pPr>
+      <w:r>
+        <w:rPr>
+          <w:rFonts w:ascii="Arial" w:hAnsi="Arial" w:cs="Arial"/>
+          <w:bCs/>
+          <w:color w:val="000000" w:themeColor="text1"/>
+          <w:sz w:val="20"/>
+          <w:szCs w:val="20"/>
+        </w:rPr>
+        <w:t>SEBESTA, Robert W.</w:t>
+      </w:r>
+      <w:r>
+        <w:rPr>
+          <w:rFonts w:ascii="Arial" w:hAnsi="Arial" w:cs="Arial"/>
+          <w:color w:val="000000" w:themeColor="text1"/>
+          <w:sz w:val="20"/>
+          <w:szCs w:val="20"/>
+        </w:rPr>
+        <w:t xml:space="preserve"> </w:t>
+      </w:r>
+      <w:r>
+        <w:rPr>
+          <w:rFonts w:ascii="Arial" w:hAnsi="Arial" w:cs="Arial"/>
+          <w:b/>
+          <w:iCs/>
+          <w:color w:val="000000" w:themeColor="text1"/>
+          <w:sz w:val="20"/>
+          <w:szCs w:val="20"/>
+        </w:rPr>
+        <w:t>Conceitos de linguagens de programação</w:t>
+      </w:r>
+      <w:r>
+        <w:rPr>
+          <w:rFonts w:ascii="Arial" w:hAnsi="Arial" w:cs="Arial"/>
+          <w:color w:val="000000" w:themeColor="text1"/>
+          <w:sz w:val="20"/>
+          <w:szCs w:val="20"/>
+        </w:rPr>
+        <w:t>. 10. ed. São Paulo: Pearson, 2018.</w:t>
+      </w:r>
     </w:p>
     <w:p>
       <w:pPr>
@@ -1261,7 +1974,7 @@
 </file>
 
 <file path=word/endnotes.xml><?xml version="1.0" encoding="utf-8"?>
-<w:endnotes xmlns:wpc="http://schemas.microsoft.com/office/word/2010/wordprocessingCanvas" xmlns:cx="http://schemas.microsoft.com/office/drawing/2014/chartex" xmlns:mc="http://schemas.openxmlformats.org/markup-compatibility/2006" xmlns:o="urn:schemas-microsoft-com:office:office" xmlns:r="http://schemas.openxmlformats.org/officeDocument/2006/relationships" xmlns:m="http://schemas.openxmlformats.org/officeDocument/2006/math" xmlns:v="urn:schemas-microsoft-com:vml" xmlns:wp14="http://schemas.microsoft.com/office/word/2010/wordprocessingDrawing" xmlns:wp="http://schemas.openxmlformats.org/drawingml/2006/wordprocessingDrawing" xmlns:w10="urn:schemas-microsoft-com:office:word" xmlns:w="http://schemas.openxmlformats.org/wordprocessingml/2006/main" xmlns:w14="http://schemas.microsoft.com/office/word/2010/wordml" xmlns:w15="http://schemas.microsoft.com/office/word/2012/wordml" xmlns:w16se="http://schemas.microsoft.com/office/word/2015/wordml/symex" xmlns:wpg="http://schemas.microsoft.com/office/word/2010/wordprocessingGroup" xmlns:wpi="http://schemas.microsoft.com/office/word/2010/wordprocessingInk" xmlns:wne="http://schemas.microsoft.com/office/word/2006/wordml" xmlns:wps="http://schemas.microsoft.com/office/word/2010/wordprocessingShape" mc:Ignorable="w14 w15 w16se wp14">
+<w:endnotes xmlns:wpc="http://schemas.microsoft.com/office/word/2010/wordprocessingCanvas" xmlns:cx="http://schemas.microsoft.com/office/drawing/2014/chartex" xmlns:cx1="http://schemas.microsoft.com/office/drawing/2015/9/8/chartex" xmlns:cx2="http://schemas.microsoft.com/office/drawing/2015/10/21/chartex" xmlns:cx3="http://schemas.microsoft.com/office/drawing/2016/5/9/chartex" xmlns:cx4="http://schemas.microsoft.com/office/drawing/2016/5/10/chartex" xmlns:cx5="http://schemas.microsoft.com/office/drawing/2016/5/11/chartex" xmlns:cx6="http://schemas.microsoft.com/office/drawing/2016/5/12/chartex" xmlns:cx7="http://schemas.microsoft.com/office/drawing/2016/5/13/chartex" xmlns:cx8="http://schemas.microsoft.com/office/drawing/2016/5/14/chartex" xmlns:mc="http://schemas.openxmlformats.org/markup-compatibility/2006" xmlns:aink="http://schemas.microsoft.com/office/drawing/2016/ink" xmlns:am3d="http://schemas.microsoft.com/office/drawing/2017/model3d" xmlns:o="urn:schemas-microsoft-com:office:office" xmlns:oel="http://schemas.microsoft.com/office/2019/extlst" xmlns:r="http://schemas.openxmlformats.org/officeDocument/2006/relationships" xmlns:m="http://schemas.openxmlformats.org/officeDocument/2006/math" xmlns:v="urn:schemas-microsoft-com:vml" xmlns:wp14="http://schemas.microsoft.com/office/word/2010/wordprocessingDrawing" xmlns:wp="http://schemas.openxmlformats.org/drawingml/2006/wordprocessingDrawing" xmlns:w10="urn:schemas-microsoft-com:office:word" xmlns:w="http://schemas.openxmlformats.org/wordprocessingml/2006/main" xmlns:w14="http://schemas.microsoft.com/office/word/2010/wordml" xmlns:w15="http://schemas.microsoft.com/office/word/2012/wordml" xmlns:w16cex="http://schemas.microsoft.com/office/word/2018/wordml/cex" xmlns:w16cid="http://schemas.microsoft.com/office/word/2016/wordml/cid" xmlns:w16="http://schemas.microsoft.com/office/word/2018/wordml" xmlns:w16du="http://schemas.microsoft.com/office/word/2023/wordml/word16du" xmlns:w16sdtdh="http://schemas.microsoft.com/office/word/2020/wordml/sdtdatahash" xmlns:w16sdtfl="http://schemas.microsoft.com/office/word/2024/wordml/sdtformatlock" xmlns:w16se="http://schemas.microsoft.com/office/word/2015/wordml/symex" xmlns:wpg="http://schemas.microsoft.com/office/word/2010/wordprocessingGroup" xmlns:wpi="http://schemas.microsoft.com/office/word/2010/wordprocessingInk" xmlns:wne="http://schemas.microsoft.com/office/word/2006/wordml" xmlns:wps="http://schemas.microsoft.com/office/word/2010/wordprocessingShape" mc:Ignorable="w14 w15 w16se w16cid w16 w16cex w16sdtdh w16sdtfl w16du wp14">
   <w:endnote w:type="separator" w:id="-1">
     <w:p>
       <w:r>
@@ -1280,7 +1993,7 @@
 </file>
 
 <file path=word/footer1.xml><?xml version="1.0" encoding="utf-8"?>
-<w:ftr xmlns:wpc="http://schemas.microsoft.com/office/word/2010/wordprocessingCanvas" xmlns:cx="http://schemas.microsoft.com/office/drawing/2014/chartex" xmlns:mc="http://schemas.openxmlformats.org/markup-compatibility/2006" xmlns:o="urn:schemas-microsoft-com:office:office" xmlns:r="http://schemas.openxmlformats.org/officeDocument/2006/relationships" xmlns:m="http://schemas.openxmlformats.org/officeDocument/2006/math" xmlns:v="urn:schemas-microsoft-com:vml" xmlns:wp14="http://schemas.microsoft.com/office/word/2010/wordprocessingDrawing" xmlns:wp="http://schemas.openxmlformats.org/drawingml/2006/wordprocessingDrawing" xmlns:w10="urn:schemas-microsoft-com:office:word" xmlns:w="http://schemas.openxmlformats.org/wordprocessingml/2006/main" xmlns:w14="http://schemas.microsoft.com/office/word/2010/wordml" xmlns:w15="http://schemas.microsoft.com/office/word/2012/wordml" xmlns:w16se="http://schemas.microsoft.com/office/word/2015/wordml/symex" xmlns:wpg="http://schemas.microsoft.com/office/word/2010/wordprocessingGroup" xmlns:wpi="http://schemas.microsoft.com/office/word/2010/wordprocessingInk" xmlns:wne="http://schemas.microsoft.com/office/word/2006/wordml" xmlns:wps="http://schemas.microsoft.com/office/word/2010/wordprocessingShape" mc:Ignorable="w14 w15 w16se wp14">
+<w:ftr xmlns:wpc="http://schemas.microsoft.com/office/word/2010/wordprocessingCanvas" xmlns:cx="http://schemas.microsoft.com/office/drawing/2014/chartex" xmlns:cx1="http://schemas.microsoft.com/office/drawing/2015/9/8/chartex" xmlns:cx2="http://schemas.microsoft.com/office/drawing/2015/10/21/chartex" xmlns:cx3="http://schemas.microsoft.com/office/drawing/2016/5/9/chartex" xmlns:cx4="http://schemas.microsoft.com/office/drawing/2016/5/10/chartex" xmlns:cx5="http://schemas.microsoft.com/office/drawing/2016/5/11/chartex" xmlns:cx6="http://schemas.microsoft.com/office/drawing/2016/5/12/chartex" xmlns:cx7="http://schemas.microsoft.com/office/drawing/2016/5/13/chartex" xmlns:cx8="http://schemas.microsoft.com/office/drawing/2016/5/14/chartex" xmlns:mc="http://schemas.openxmlformats.org/markup-compatibility/2006" xmlns:aink="http://schemas.microsoft.com/office/drawing/2016/ink" xmlns:am3d="http://schemas.microsoft.com/office/drawing/2017/model3d" xmlns:o="urn:schemas-microsoft-com:office:office" xmlns:oel="http://schemas.microsoft.com/office/2019/extlst" xmlns:r="http://schemas.openxmlformats.org/officeDocument/2006/relationships" xmlns:m="http://schemas.openxmlformats.org/officeDocument/2006/math" xmlns:v="urn:schemas-microsoft-com:vml" xmlns:wp14="http://schemas.microsoft.com/office/word/2010/wordprocessingDrawing" xmlns:wp="http://schemas.openxmlformats.org/drawingml/2006/wordprocessingDrawing" xmlns:w10="urn:schemas-microsoft-com:office:word" xmlns:w="http://schemas.openxmlformats.org/wordprocessingml/2006/main" xmlns:w14="http://schemas.microsoft.com/office/word/2010/wordml" xmlns:w15="http://schemas.microsoft.com/office/word/2012/wordml" xmlns:w16cex="http://schemas.microsoft.com/office/word/2018/wordml/cex" xmlns:w16cid="http://schemas.microsoft.com/office/word/2016/wordml/cid" xmlns:w16="http://schemas.microsoft.com/office/word/2018/wordml" xmlns:w16du="http://schemas.microsoft.com/office/word/2023/wordml/word16du" xmlns:w16sdtdh="http://schemas.microsoft.com/office/word/2020/wordml/sdtdatahash" xmlns:w16sdtfl="http://schemas.microsoft.com/office/word/2024/wordml/sdtformatlock" xmlns:w16se="http://schemas.microsoft.com/office/word/2015/wordml/symex" xmlns:wpg="http://schemas.microsoft.com/office/word/2010/wordprocessingGroup" xmlns:wpi="http://schemas.microsoft.com/office/word/2010/wordprocessingInk" xmlns:wne="http://schemas.microsoft.com/office/word/2006/wordml" xmlns:wps="http://schemas.microsoft.com/office/word/2010/wordprocessingShape" mc:Ignorable="w14 w15 w16se w16cid w16 w16cex w16sdtdh w16sdtfl w16du wp14">
   <w:p>
     <w:pPr>
       <w:pStyle w:val="Rodap"/>
@@ -1432,7 +2145,7 @@
               <v:stroke joinstyle="miter"/>
               <v:path gradientshapeok="t" o:connecttype="rect"/>
             </v:shapetype>
-            <v:shape id="Text Box 5" o:spid="_x0000_s1026" type="#_x0000_t202" style="position:absolute;margin-left:457.2pt;margin-top:13.45pt;width:9.75pt;height:16.5pt;z-index:251657728;visibility:visible;mso-wrap-style:square;mso-width-percent:0;mso-height-percent:0;mso-wrap-distance-left:0;mso-wrap-distance-top:0;mso-wrap-distance-right:0;mso-wrap-distance-bottom:0;mso-position-horizontal:absolute;mso-position-horizontal-relative:margin;mso-position-vertical:absolute;mso-position-vertical-relative:text;mso-width-percent:0;mso-height-percent:0;mso-width-relative:page;mso-height-relative:page;v-text-anchor:top" o:gfxdata="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" stroked="f">
+            <v:shape id="Text Box 5" o:spid="_x0000_s1026" type="#_x0000_t202" style="position:absolute;margin-left:457.2pt;margin-top:13.45pt;width:9.75pt;height:16.5pt;z-index:251657728;visibility:visible;mso-wrap-style:square;mso-width-percent:0;mso-height-percent:0;mso-wrap-distance-left:0;mso-wrap-distance-top:0;mso-wrap-distance-right:0;mso-wrap-distance-bottom:0;mso-position-horizontal:absolute;mso-position-horizontal-relative:margin;mso-position-vertical:absolute;mso-position-vertical-relative:text;mso-width-percent:0;mso-height-percent:0;mso-width-relative:page;mso-height-relative:page;v-text-anchor:top" o:gfxdata="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" stroked="f">
               <v:fill opacity="0"/>
               <v:textbox inset="0,0,0,0">
                 <w:txbxContent>
@@ -1579,7 +2292,7 @@
             </wp:anchor>
           </w:drawing>
         </mc:Choice>
-        <mc:Fallback xmlns:cx1="http://schemas.microsoft.com/office/drawing/2015/9/8/chartex" xmlns:cx2="http://schemas.microsoft.com/office/drawing/2015/10/21/chartex" xmlns:cx3="http://schemas.microsoft.com/office/drawing/2016/5/9/chartex" xmlns:cx4="http://schemas.microsoft.com/office/drawing/2016/5/10/chartex" xmlns:cx5="http://schemas.microsoft.com/office/drawing/2016/5/11/chartex" xmlns:cx6="http://schemas.microsoft.com/office/drawing/2016/5/12/chartex" xmlns:cx7="http://schemas.microsoft.com/office/drawing/2016/5/13/chartex" xmlns:cx8="http://schemas.microsoft.com/office/drawing/2016/5/14/chartex" xmlns:aink="http://schemas.microsoft.com/office/drawing/2016/ink" xmlns:am3d="http://schemas.microsoft.com/office/drawing/2017/model3d" xmlns:w16cid="http://schemas.microsoft.com/office/word/2016/wordml/cid" xmlns:w16sdtfl="http://schemas.microsoft.com/office/word/2024/wordml/sdtformatlock" xmlns:w16sdtdh="http://schemas.microsoft.com/office/word/2020/wordml/sdtdatahash" xmlns:w16du="http://schemas.microsoft.com/office/word/2023/wordml/word16du" xmlns:w16="http://schemas.microsoft.com/office/word/2018/wordml" xmlns:w16cex="http://schemas.microsoft.com/office/word/2018/wordml/cex" xmlns:oel="http://schemas.microsoft.com/office/2019/extlst">
+        <mc:Fallback>
           <w:pict>
             <v:line w14:anchorId="4438070D" id="Line 2" o:spid="_x0000_s1026" style="position:absolute;z-index:-251659776;visibility:visible;mso-wrap-style:square;mso-width-percent:0;mso-height-percent:0;mso-wrap-distance-left:9pt;mso-wrap-distance-top:0;mso-wrap-distance-right:9pt;mso-wrap-distance-bottom:0;mso-position-horizontal:absolute;mso-position-horizontal-relative:text;mso-position-vertical:absolute;mso-position-vertical-relative:text;mso-width-percent:0;mso-height-percent:0;mso-width-relative:page;mso-height-relative:page" from="-2.85pt,9.2pt" to="451.95pt,9.2pt" o:gfxdata="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" strokeweight=".26mm">
               <v:stroke joinstyle="miter"/>
@@ -1667,7 +2380,7 @@
             </wp:anchor>
           </w:drawing>
         </mc:Choice>
-        <mc:Fallback xmlns:cx1="http://schemas.microsoft.com/office/drawing/2015/9/8/chartex" xmlns:cx2="http://schemas.microsoft.com/office/drawing/2015/10/21/chartex" xmlns:cx3="http://schemas.microsoft.com/office/drawing/2016/5/9/chartex" xmlns:cx4="http://schemas.microsoft.com/office/drawing/2016/5/10/chartex" xmlns:cx5="http://schemas.microsoft.com/office/drawing/2016/5/11/chartex" xmlns:cx6="http://schemas.microsoft.com/office/drawing/2016/5/12/chartex" xmlns:cx7="http://schemas.microsoft.com/office/drawing/2016/5/13/chartex" xmlns:cx8="http://schemas.microsoft.com/office/drawing/2016/5/14/chartex" xmlns:aink="http://schemas.microsoft.com/office/drawing/2016/ink" xmlns:am3d="http://schemas.microsoft.com/office/drawing/2017/model3d" xmlns:w16cid="http://schemas.microsoft.com/office/word/2016/wordml/cid" xmlns:w16sdtfl="http://schemas.microsoft.com/office/word/2024/wordml/sdtformatlock" xmlns:w16sdtdh="http://schemas.microsoft.com/office/word/2020/wordml/sdtdatahash" xmlns:w16du="http://schemas.microsoft.com/office/word/2023/wordml/word16du" xmlns:w16="http://schemas.microsoft.com/office/word/2018/wordml" xmlns:w16cex="http://schemas.microsoft.com/office/word/2018/wordml/cex" xmlns:oel="http://schemas.microsoft.com/office/2019/extlst">
+        <mc:Fallback>
           <w:pict>
             <v:line w14:anchorId="76283B7A" id="Line 6" o:spid="_x0000_s1026" style="position:absolute;z-index:-251657728;visibility:visible;mso-wrap-style:square;mso-width-percent:0;mso-height-percent:0;mso-wrap-distance-left:9pt;mso-wrap-distance-top:0;mso-wrap-distance-right:9pt;mso-wrap-distance-bottom:0;mso-position-horizontal:absolute;mso-position-horizontal-relative:text;mso-position-vertical:absolute;mso-position-vertical-relative:text;mso-width-percent:0;mso-height-percent:0;mso-width-relative:page;mso-height-relative:page" from="-2.85pt,9.2pt" to="451.95pt,9.2pt" o:gfxdata="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" strokeweight=".26mm">
               <v:stroke joinstyle="miter"/>
@@ -1772,7 +2485,7 @@
 </file>
 
 <file path=word/footnotes.xml><?xml version="1.0" encoding="utf-8"?>
-<w:footnotes xmlns:wpc="http://schemas.microsoft.com/office/word/2010/wordprocessingCanvas" xmlns:cx="http://schemas.microsoft.com/office/drawing/2014/chartex" xmlns:mc="http://schemas.openxmlformats.org/markup-compatibility/2006" xmlns:o="urn:schemas-microsoft-com:office:office" xmlns:r="http://schemas.openxmlformats.org/officeDocument/2006/relationships" xmlns:m="http://schemas.openxmlformats.org/officeDocument/2006/math" xmlns:v="urn:schemas-microsoft-com:vml" xmlns:wp14="http://schemas.microsoft.com/office/word/2010/wordprocessingDrawing" xmlns:wp="http://schemas.openxmlformats.org/drawingml/2006/wordprocessingDrawing" xmlns:w10="urn:schemas-microsoft-com:office:word" xmlns:w="http://schemas.openxmlformats.org/wordprocessingml/2006/main" xmlns:w14="http://schemas.microsoft.com/office/word/2010/wordml" xmlns:w15="http://schemas.microsoft.com/office/word/2012/wordml" xmlns:w16se="http://schemas.microsoft.com/office/word/2015/wordml/symex" xmlns:wpg="http://schemas.microsoft.com/office/word/2010/wordprocessingGroup" xmlns:wpi="http://schemas.microsoft.com/office/word/2010/wordprocessingInk" xmlns:wne="http://schemas.microsoft.com/office/word/2006/wordml" xmlns:wps="http://schemas.microsoft.com/office/word/2010/wordprocessingShape" mc:Ignorable="w14 w15 w16se wp14">
+<w:footnotes xmlns:wpc="http://schemas.microsoft.com/office/word/2010/wordprocessingCanvas" xmlns:cx="http://schemas.microsoft.com/office/drawing/2014/chartex" xmlns:cx1="http://schemas.microsoft.com/office/drawing/2015/9/8/chartex" xmlns:cx2="http://schemas.microsoft.com/office/drawing/2015/10/21/chartex" xmlns:cx3="http://schemas.microsoft.com/office/drawing/2016/5/9/chartex" xmlns:cx4="http://schemas.microsoft.com/office/drawing/2016/5/10/chartex" xmlns:cx5="http://schemas.microsoft.com/office/drawing/2016/5/11/chartex" xmlns:cx6="http://schemas.microsoft.com/office/drawing/2016/5/12/chartex" xmlns:cx7="http://schemas.microsoft.com/office/drawing/2016/5/13/chartex" xmlns:cx8="http://schemas.microsoft.com/office/drawing/2016/5/14/chartex" xmlns:mc="http://schemas.openxmlformats.org/markup-compatibility/2006" xmlns:aink="http://schemas.microsoft.com/office/drawing/2016/ink" xmlns:am3d="http://schemas.microsoft.com/office/drawing/2017/model3d" xmlns:o="urn:schemas-microsoft-com:office:office" xmlns:oel="http://schemas.microsoft.com/office/2019/extlst" xmlns:r="http://schemas.openxmlformats.org/officeDocument/2006/relationships" xmlns:m="http://schemas.openxmlformats.org/officeDocument/2006/math" xmlns:v="urn:schemas-microsoft-com:vml" xmlns:wp14="http://schemas.microsoft.com/office/word/2010/wordprocessingDrawing" xmlns:wp="http://schemas.openxmlformats.org/drawingml/2006/wordprocessingDrawing" xmlns:w10="urn:schemas-microsoft-com:office:word" xmlns:w="http://schemas.openxmlformats.org/wordprocessingml/2006/main" xmlns:w14="http://schemas.microsoft.com/office/word/2010/wordml" xmlns:w15="http://schemas.microsoft.com/office/word/2012/wordml" xmlns:w16cex="http://schemas.microsoft.com/office/word/2018/wordml/cex" xmlns:w16cid="http://schemas.microsoft.com/office/word/2016/wordml/cid" xmlns:w16="http://schemas.microsoft.com/office/word/2018/wordml" xmlns:w16du="http://schemas.microsoft.com/office/word/2023/wordml/word16du" xmlns:w16sdtdh="http://schemas.microsoft.com/office/word/2020/wordml/sdtdatahash" xmlns:w16sdtfl="http://schemas.microsoft.com/office/word/2024/wordml/sdtformatlock" xmlns:w16se="http://schemas.microsoft.com/office/word/2015/wordml/symex" xmlns:wpg="http://schemas.microsoft.com/office/word/2010/wordprocessingGroup" xmlns:wpi="http://schemas.microsoft.com/office/word/2010/wordprocessingInk" xmlns:wne="http://schemas.microsoft.com/office/word/2006/wordml" xmlns:wps="http://schemas.microsoft.com/office/word/2010/wordprocessingShape" mc:Ignorable="w14 w15 w16se w16cid w16 w16cex w16sdtdh w16sdtfl w16du wp14">
   <w:footnote w:type="separator" w:id="-1">
     <w:p>
       <w:r>
@@ -1791,7 +2504,7 @@
 </file>
 
 <file path=word/header1.xml><?xml version="1.0" encoding="utf-8"?>
-<w:hdr xmlns:wpc="http://schemas.microsoft.com/office/word/2010/wordprocessingCanvas" xmlns:cx="http://schemas.microsoft.com/office/drawing/2014/chartex" xmlns:mc="http://schemas.openxmlformats.org/markup-compatibility/2006" xmlns:o="urn:schemas-microsoft-com:office:office" xmlns:r="http://schemas.openxmlformats.org/officeDocument/2006/relationships" xmlns:m="http://schemas.openxmlformats.org/officeDocument/2006/math" xmlns:v="urn:schemas-microsoft-com:vml" xmlns:wp14="http://schemas.microsoft.com/office/word/2010/wordprocessingDrawing" xmlns:wp="http://schemas.openxmlformats.org/drawingml/2006/wordprocessingDrawing" xmlns:w10="urn:schemas-microsoft-com:office:word" xmlns:w="http://schemas.openxmlformats.org/wordprocessingml/2006/main" xmlns:w14="http://schemas.microsoft.com/office/word/2010/wordml" xmlns:w15="http://schemas.microsoft.com/office/word/2012/wordml" xmlns:w16se="http://schemas.microsoft.com/office/word/2015/wordml/symex" xmlns:wpg="http://schemas.microsoft.com/office/word/2010/wordprocessingGroup" xmlns:wpi="http://schemas.microsoft.com/office/word/2010/wordprocessingInk" xmlns:wne="http://schemas.microsoft.com/office/word/2006/wordml" xmlns:wps="http://schemas.microsoft.com/office/word/2010/wordprocessingShape" mc:Ignorable="w14 w15 w16se wp14">
+<w:hdr xmlns:wpc="http://schemas.microsoft.com/office/word/2010/wordprocessingCanvas" xmlns:cx="http://schemas.microsoft.com/office/drawing/2014/chartex" xmlns:cx1="http://schemas.microsoft.com/office/drawing/2015/9/8/chartex" xmlns:cx2="http://schemas.microsoft.com/office/drawing/2015/10/21/chartex" xmlns:cx3="http://schemas.microsoft.com/office/drawing/2016/5/9/chartex" xmlns:cx4="http://schemas.microsoft.com/office/drawing/2016/5/10/chartex" xmlns:cx5="http://schemas.microsoft.com/office/drawing/2016/5/11/chartex" xmlns:cx6="http://schemas.microsoft.com/office/drawing/2016/5/12/chartex" xmlns:cx7="http://schemas.microsoft.com/office/drawing/2016/5/13/chartex" xmlns:cx8="http://schemas.microsoft.com/office/drawing/2016/5/14/chartex" xmlns:mc="http://schemas.openxmlformats.org/markup-compatibility/2006" xmlns:aink="http://schemas.microsoft.com/office/drawing/2016/ink" xmlns:am3d="http://schemas.microsoft.com/office/drawing/2017/model3d" xmlns:o="urn:schemas-microsoft-com:office:office" xmlns:oel="http://schemas.microsoft.com/office/2019/extlst" xmlns:r="http://schemas.openxmlformats.org/officeDocument/2006/relationships" xmlns:m="http://schemas.openxmlformats.org/officeDocument/2006/math" xmlns:v="urn:schemas-microsoft-com:vml" xmlns:wp14="http://schemas.microsoft.com/office/word/2010/wordprocessingDrawing" xmlns:wp="http://schemas.openxmlformats.org/drawingml/2006/wordprocessingDrawing" xmlns:w10="urn:schemas-microsoft-com:office:word" xmlns:w="http://schemas.openxmlformats.org/wordprocessingml/2006/main" xmlns:w14="http://schemas.microsoft.com/office/word/2010/wordml" xmlns:w15="http://schemas.microsoft.com/office/word/2012/wordml" xmlns:w16cex="http://schemas.microsoft.com/office/word/2018/wordml/cex" xmlns:w16cid="http://schemas.microsoft.com/office/word/2016/wordml/cid" xmlns:w16="http://schemas.microsoft.com/office/word/2018/wordml" xmlns:w16du="http://schemas.microsoft.com/office/word/2023/wordml/word16du" xmlns:w16sdtdh="http://schemas.microsoft.com/office/word/2020/wordml/sdtdatahash" xmlns:w16sdtfl="http://schemas.microsoft.com/office/word/2024/wordml/sdtformatlock" xmlns:w16se="http://schemas.microsoft.com/office/word/2015/wordml/symex" xmlns:wpg="http://schemas.microsoft.com/office/word/2010/wordprocessingGroup" xmlns:wpi="http://schemas.microsoft.com/office/word/2010/wordprocessingInk" xmlns:wne="http://schemas.microsoft.com/office/word/2006/wordml" xmlns:wps="http://schemas.microsoft.com/office/word/2010/wordprocessingShape" mc:Ignorable="w14 w15 w16se w16cid w16 w16cex w16sdtdh w16sdtfl w16du wp14">
   <w:p>
     <w:pPr>
       <w:pStyle w:val="Cabealho"/>
@@ -1877,7 +2590,7 @@
 </file>
 
 <file path=word/numbering.xml><?xml version="1.0" encoding="utf-8"?>
-<w:numbering xmlns:wpc="http://schemas.microsoft.com/office/word/2010/wordprocessingCanvas" xmlns:cx="http://schemas.microsoft.com/office/drawing/2014/chartex" xmlns:mc="http://schemas.openxmlformats.org/markup-compatibility/2006" xmlns:o="urn:schemas-microsoft-com:office:office" xmlns:r="http://schemas.openxmlformats.org/officeDocument/2006/relationships" xmlns:m="http://schemas.openxmlformats.org/officeDocument/2006/math" xmlns:v="urn:schemas-microsoft-com:vml" xmlns:wp14="http://schemas.microsoft.com/office/word/2010/wordprocessingDrawing" xmlns:wp="http://schemas.openxmlformats.org/drawingml/2006/wordprocessingDrawing" xmlns:w10="urn:schemas-microsoft-com:office:word" xmlns:w="http://schemas.openxmlformats.org/wordprocessingml/2006/main" xmlns:w14="http://schemas.microsoft.com/office/word/2010/wordml" xmlns:w15="http://schemas.microsoft.com/office/word/2012/wordml" xmlns:w16se="http://schemas.microsoft.com/office/word/2015/wordml/symex" xmlns:wpg="http://schemas.microsoft.com/office/word/2010/wordprocessingGroup" xmlns:wpi="http://schemas.microsoft.com/office/word/2010/wordprocessingInk" xmlns:wne="http://schemas.microsoft.com/office/word/2006/wordml" xmlns:wps="http://schemas.microsoft.com/office/word/2010/wordprocessingShape" mc:Ignorable="w14 w15 w16se wp14">
+<w:numbering xmlns:wpc="http://schemas.microsoft.com/office/word/2010/wordprocessingCanvas" xmlns:cx="http://schemas.microsoft.com/office/drawing/2014/chartex" xmlns:cx1="http://schemas.microsoft.com/office/drawing/2015/9/8/chartex" xmlns:cx2="http://schemas.microsoft.com/office/drawing/2015/10/21/chartex" xmlns:cx3="http://schemas.microsoft.com/office/drawing/2016/5/9/chartex" xmlns:cx4="http://schemas.microsoft.com/office/drawing/2016/5/10/chartex" xmlns:cx5="http://schemas.microsoft.com/office/drawing/2016/5/11/chartex" xmlns:cx6="http://schemas.microsoft.com/office/drawing/2016/5/12/chartex" xmlns:cx7="http://schemas.microsoft.com/office/drawing/2016/5/13/chartex" xmlns:cx8="http://schemas.microsoft.com/office/drawing/2016/5/14/chartex" xmlns:mc="http://schemas.openxmlformats.org/markup-compatibility/2006" xmlns:aink="http://schemas.microsoft.com/office/drawing/2016/ink" xmlns:am3d="http://schemas.microsoft.com/office/drawing/2017/model3d" xmlns:o="urn:schemas-microsoft-com:office:office" xmlns:oel="http://schemas.microsoft.com/office/2019/extlst" xmlns:r="http://schemas.openxmlformats.org/officeDocument/2006/relationships" xmlns:m="http://schemas.openxmlformats.org/officeDocument/2006/math" xmlns:v="urn:schemas-microsoft-com:vml" xmlns:wp14="http://schemas.microsoft.com/office/word/2010/wordprocessingDrawing" xmlns:wp="http://schemas.openxmlformats.org/drawingml/2006/wordprocessingDrawing" xmlns:w10="urn:schemas-microsoft-com:office:word" xmlns:w="http://schemas.openxmlformats.org/wordprocessingml/2006/main" xmlns:w14="http://schemas.microsoft.com/office/word/2010/wordml" xmlns:w15="http://schemas.microsoft.com/office/word/2012/wordml" xmlns:w16cex="http://schemas.microsoft.com/office/word/2018/wordml/cex" xmlns:w16cid="http://schemas.microsoft.com/office/word/2016/wordml/cid" xmlns:w16="http://schemas.microsoft.com/office/word/2018/wordml" xmlns:w16du="http://schemas.microsoft.com/office/word/2023/wordml/word16du" xmlns:w16sdtdh="http://schemas.microsoft.com/office/word/2020/wordml/sdtdatahash" xmlns:w16sdtfl="http://schemas.microsoft.com/office/word/2024/wordml/sdtformatlock" xmlns:w16se="http://schemas.microsoft.com/office/word/2015/wordml/symex" xmlns:wpg="http://schemas.microsoft.com/office/word/2010/wordprocessingGroup" xmlns:wpi="http://schemas.microsoft.com/office/word/2010/wordprocessingInk" xmlns:wne="http://schemas.microsoft.com/office/word/2006/wordml" xmlns:wps="http://schemas.microsoft.com/office/word/2010/wordprocessingShape" mc:Ignorable="w14 w15 w16se w16cid w16 w16cex w16sdtdh w16sdtfl w16du wp14">
   <w:abstractNum w:abstractNumId="0" w15:restartNumberingAfterBreak="0">
     <w:nsid w:val="00000001"/>
     <w:multiLevelType w:val="multilevel"/>
@@ -2001,14 +2714,14 @@
       </w:pPr>
     </w:lvl>
   </w:abstractNum>
-  <w:num w:numId="1">
+  <w:num w:numId="1" w16cid:durableId="1419642662">
     <w:abstractNumId w:val="0"/>
   </w:num>
 </w:numbering>
 </file>
 
 <file path=word/styles.xml><?xml version="1.0" encoding="utf-8"?>
-<w:styles xmlns:mc="http://schemas.openxmlformats.org/markup-compatibility/2006" xmlns:r="http://schemas.openxmlformats.org/officeDocument/2006/relationships" xmlns:w="http://schemas.openxmlformats.org/wordprocessingml/2006/main" xmlns:w14="http://schemas.microsoft.com/office/word/2010/wordml" xmlns:w15="http://schemas.microsoft.com/office/word/2012/wordml" xmlns:w16se="http://schemas.microsoft.com/office/word/2015/wordml/symex" mc:Ignorable="w14 w15 w16se">
+<w:styles xmlns:mc="http://schemas.openxmlformats.org/markup-compatibility/2006" xmlns:r="http://schemas.openxmlformats.org/officeDocument/2006/relationships" xmlns:w="http://schemas.openxmlformats.org/wordprocessingml/2006/main" xmlns:w14="http://schemas.microsoft.com/office/word/2010/wordml" xmlns:w15="http://schemas.microsoft.com/office/word/2012/wordml" xmlns:w16cex="http://schemas.microsoft.com/office/word/2018/wordml/cex" xmlns:w16cid="http://schemas.microsoft.com/office/word/2016/wordml/cid" xmlns:w16="http://schemas.microsoft.com/office/word/2018/wordml" xmlns:w16du="http://schemas.microsoft.com/office/word/2023/wordml/word16du" xmlns:w16sdtdh="http://schemas.microsoft.com/office/word/2020/wordml/sdtdatahash" xmlns:w16sdtfl="http://schemas.microsoft.com/office/word/2024/wordml/sdtformatlock" xmlns:w16se="http://schemas.microsoft.com/office/word/2015/wordml/symex" mc:Ignorable="w14 w15 w16se w16cid w16 w16cex w16sdtdh w16sdtfl w16du">
   <w:docDefaults>
     <w:rPrDefault>
       <w:rPr>
@@ -2018,7 +2731,7 @@
     </w:rPrDefault>
     <w:pPrDefault/>
   </w:docDefaults>
-  <w:latentStyles w:defLockedState="0" w:defUIPriority="0" w:defSemiHidden="0" w:defUnhideWhenUsed="0" w:defQFormat="0" w:count="371">
+  <w:latentStyles w:defLockedState="0" w:defUIPriority="0" w:defSemiHidden="0" w:defUnhideWhenUsed="0" w:defQFormat="0" w:count="376">
     <w:lsdException w:name="Normal" w:qFormat="1"/>
     <w:lsdException w:name="heading 1" w:qFormat="1"/>
     <w:lsdException w:name="heading 2" w:semiHidden="1" w:unhideWhenUsed="1" w:qFormat="1"/>
@@ -2032,8 +2745,10 @@
     <w:lsdException w:name="caption" w:semiHidden="1" w:unhideWhenUsed="1" w:qFormat="1"/>
     <w:lsdException w:name="Title" w:qFormat="1"/>
     <w:lsdException w:name="Subtitle" w:qFormat="1"/>
-    <w:lsdException w:name="Strong" w:qFormat="1"/>
+    <w:lsdException w:name="Hyperlink" w:uiPriority="99"/>
+    <w:lsdException w:name="Strong" w:uiPriority="22" w:qFormat="1"/>
     <w:lsdException w:name="Emphasis" w:qFormat="1"/>
+    <w:lsdException w:name="Normal (Web)" w:uiPriority="99"/>
     <w:lsdException w:name="HTML Keyboard" w:semiHidden="1" w:unhideWhenUsed="1"/>
     <w:lsdException w:name="HTML Preformatted" w:semiHidden="1" w:unhideWhenUsed="1"/>
     <w:lsdException w:name="Normal Table" w:semiHidden="1" w:unhideWhenUsed="1"/>
@@ -2301,6 +3016,11 @@
     <w:lsdException w:name="List Table 5 Dark Accent 6" w:uiPriority="50"/>
     <w:lsdException w:name="List Table 6 Colorful Accent 6" w:uiPriority="51"/>
     <w:lsdException w:name="List Table 7 Colorful Accent 6" w:uiPriority="52"/>
+    <w:lsdException w:name="Mention" w:semiHidden="1" w:uiPriority="99" w:unhideWhenUsed="1"/>
+    <w:lsdException w:name="Smart Hyperlink" w:semiHidden="1" w:uiPriority="99" w:unhideWhenUsed="1"/>
+    <w:lsdException w:name="Hashtag" w:semiHidden="1" w:uiPriority="99" w:unhideWhenUsed="1"/>
+    <w:lsdException w:name="Unresolved Mention" w:semiHidden="1" w:uiPriority="99" w:unhideWhenUsed="1"/>
+    <w:lsdException w:name="Smart Link" w:semiHidden="1" w:uiPriority="99" w:unhideWhenUsed="1"/>
   </w:latentStyles>
   <w:style w:type="paragraph" w:default="1" w:styleId="Normal">
     <w:name w:val="Normal"/>
@@ -2391,6 +3111,7 @@
   </w:style>
   <w:style w:type="character" w:styleId="Hyperlink">
     <w:name w:val="Hyperlink"/>
+    <w:uiPriority w:val="99"/>
     <w:rPr>
       <w:color w:val="0000FF"/>
       <w:u w:val="single"/>
@@ -2398,6 +3119,7 @@
   </w:style>
   <w:style w:type="character" w:styleId="Forte">
     <w:name w:val="Strong"/>
+    <w:uiPriority w:val="22"/>
     <w:qFormat/>
     <w:rPr>
       <w:b/>
@@ -2695,8 +3417,8 @@
       <w:lang w:eastAsia="ar-SA"/>
     </w:rPr>
   </w:style>
-  <w:style w:type="character" w:customStyle="1" w:styleId="UnresolvedMention">
-    <w:name w:val="Unresolved Mention"/>
+  <w:style w:type="character" w:customStyle="1" w:styleId="MenoPendente1">
+    <w:name w:val="Menção Pendente1"/>
     <w:basedOn w:val="Fontepargpadro"/>
     <w:uiPriority w:val="99"/>
     <w:semiHidden/>
@@ -2719,6 +3441,32 @@
       <w:sz w:val="26"/>
       <w:szCs w:val="26"/>
       <w:lang w:eastAsia="ar-SA"/>
+    </w:rPr>
+  </w:style>
+  <w:style w:type="character" w:styleId="MenoPendente">
+    <w:name w:val="Unresolved Mention"/>
+    <w:basedOn w:val="Fontepargpadro"/>
+    <w:uiPriority w:val="99"/>
+    <w:semiHidden/>
+    <w:unhideWhenUsed/>
+    <w:rsid w:val="0020223D"/>
+    <w:rPr>
+      <w:color w:val="605E5C"/>
+      <w:shd w:val="clear" w:color="auto" w:fill="E1DFDD"/>
+    </w:rPr>
+  </w:style>
+  <w:style w:type="paragraph" w:styleId="NormalWeb">
+    <w:name w:val="Normal (Web)"/>
+    <w:basedOn w:val="Normal"/>
+    <w:uiPriority w:val="99"/>
+    <w:unhideWhenUsed/>
+    <w:rsid w:val="003D1384"/>
+    <w:pPr>
+      <w:suppressAutoHyphens w:val="0"/>
+      <w:spacing w:before="100" w:beforeAutospacing="1" w:after="100" w:afterAutospacing="1"/>
+    </w:pPr>
+    <w:rPr>
+      <w:lang w:eastAsia="pt-BR"/>
     </w:rPr>
   </w:style>
 </w:styles>

</xml_diff>